<commit_message>
Finished with all tcs
</commit_message>
<xml_diff>
--- a/tc-1_2_3_fixed.docx
+++ b/tc-1_2_3_fixed.docx
@@ -24,9 +24,8 @@
     </w:p>
     <w:p>
       <w:pPr>
-        <w:pStyle w:val="Heading1"/>
-        <w:spacing w:before="0"/>
-        <w:ind w:firstLine="340"/>
+        <w:pStyle w:val="Title"/>
+        <w:spacing w:before="240" w:after="120"/>
         <w:rPr>
           <w:rFonts w:ascii="Times New Roman" w:hAnsi="Times New Roman" w:cs="Times New Roman"/>
           <w:lang w:val="ru-RU"/>
@@ -42,8 +41,7 @@
     </w:p>
     <w:p>
       <w:pPr>
-        <w:pStyle w:val="Heading2"/>
-        <w:ind w:firstLine="340"/>
+        <w:pStyle w:val="Heading1"/>
         <w:rPr>
           <w:rFonts w:ascii="Times New Roman" w:hAnsi="Times New Roman" w:cs="Times New Roman"/>
           <w:lang w:val="ru-RU"/>
@@ -1987,6 +1985,7 @@
           <w:rFonts w:cs="Times New Roman"/>
           <w:lang w:val="ru-RU"/>
         </w:rPr>
+        <w:lastRenderedPageBreak/>
         <w:t xml:space="preserve">Условие: </w:t>
       </w:r>
       <m:oMath>
@@ -4593,6 +4592,7 @@
           <w:rFonts w:ascii="Times New Roman" w:hAnsi="Times New Roman" w:cs="Times New Roman"/>
           <w:lang w:val="ru-RU"/>
         </w:rPr>
+        <w:lastRenderedPageBreak/>
         <w:t>Задача 6</w:t>
       </w:r>
       <w:bookmarkEnd w:id="12"/>
@@ -4628,7 +4628,6 @@
           <w:rFonts w:cs="Times New Roman"/>
           <w:lang w:val="ru-RU"/>
         </w:rPr>
-        <w:lastRenderedPageBreak/>
         <w:t>"двойная шестерка" выпадет точно один раз.</w:t>
       </w:r>
     </w:p>
@@ -5365,8 +5364,12 @@
         <w:t>6) вероятность</w:t>
       </w:r>
       <w:r>
+        <w:rPr>
+          <w:lang w:val="ru-RU"/>
+        </w:rPr>
         <w:t xml:space="preserve"> </w:t>
       </w:r>
+      <w:proofErr w:type="gramStart"/>
       <w:r>
         <w:t>P</w:t>
       </w:r>
@@ -5376,7 +5379,11 @@
         </w:rPr>
         <w:t>{</w:t>
       </w:r>
+      <w:proofErr w:type="gramEnd"/>
       <w:r>
+        <w:rPr>
+          <w:lang w:val="ru-RU"/>
+        </w:rPr>
         <w:t xml:space="preserve">-1 </w:t>
       </w:r>
       <w:r>
@@ -5386,7 +5393,13 @@
         <w:t>≤</w:t>
       </w:r>
       <w:r>
-        <w:t xml:space="preserve"> X</w:t>
+        <w:rPr>
+          <w:lang w:val="ru-RU"/>
+        </w:rPr>
+        <w:t xml:space="preserve"> </w:t>
+      </w:r>
+      <w:r>
+        <w:t>X</w:t>
       </w:r>
       <w:r>
         <w:rPr>
@@ -5395,6 +5408,9 @@
         <w:t>≤</w:t>
       </w:r>
       <w:r>
+        <w:rPr>
+          <w:lang w:val="ru-RU"/>
+        </w:rPr>
         <w:t xml:space="preserve"> 2}</w:t>
       </w:r>
       <w:r>
@@ -6882,6 +6898,7 @@
           <w:rFonts w:cs="Times New Roman"/>
           <w:lang w:val="ru-RU"/>
         </w:rPr>
+        <w:lastRenderedPageBreak/>
         <w:t xml:space="preserve">График: ступенчатая функция с горизонтальными отрезками и скачками в точках </w:t>
       </w:r>
       <m:oMath>
@@ -6982,7 +6999,6 @@
         <w:rPr>
           <w:rFonts w:ascii="Times New Roman" w:hAnsi="Times New Roman" w:cs="Times New Roman"/>
         </w:rPr>
-        <w:lastRenderedPageBreak/>
         <w:t>3) Математическое ожидание</w:t>
       </w:r>
     </w:p>
@@ -12141,6 +12157,9 @@
         <w:t>распределена нормально с параметрами (</w:t>
       </w:r>
       <w:r>
+        <w:rPr>
+          <w:lang w:val="ru-RU"/>
+        </w:rPr>
         <w:t>0; 0,4</w:t>
       </w:r>
       <w:r>
@@ -12591,13 +12610,7 @@
             <w:rPr>
               <w:rFonts w:ascii="Cambria Math" w:hAnsi="Cambria Math" w:cs="Times New Roman"/>
             </w:rPr>
-            <m:t>P</m:t>
-          </m:r>
-          <m:r>
-            <w:rPr>
-              <w:rFonts w:ascii="Cambria Math" w:hAnsi="Cambria Math" w:cs="Times New Roman"/>
-            </w:rPr>
-            <m:t>{</m:t>
+            <m:t>P{</m:t>
           </m:r>
           <m:d>
             <m:dPr>
@@ -12646,13 +12659,7 @@
             <w:rPr>
               <w:rFonts w:ascii="Cambria Math" w:hAnsi="Cambria Math" w:cs="Times New Roman"/>
             </w:rPr>
-            <m:t>7</m:t>
-          </m:r>
-          <m:r>
-            <w:rPr>
-              <w:rFonts w:ascii="Cambria Math" w:hAnsi="Cambria Math" w:cs="Times New Roman"/>
-            </w:rPr>
-            <m:t>}</m:t>
+            <m:t>7}</m:t>
           </m:r>
           <m:r>
             <m:rPr>
@@ -13439,14 +13446,13 @@
     <w:p>
       <w:pPr>
         <w:pStyle w:val="Heading1"/>
-        <w:ind w:firstLine="340"/>
         <w:rPr>
           <w:rFonts w:ascii="Times New Roman" w:hAnsi="Times New Roman" w:cs="Times New Roman"/>
           <w:lang w:val="ru-RU"/>
         </w:rPr>
       </w:pPr>
-      <w:bookmarkStart w:id="34" w:name="_Toc231087997"/>
-      <w:bookmarkStart w:id="35" w:name="типовой-расчёт-2-по-теории-вероятностей"/>
+      <w:bookmarkStart w:id="34" w:name="типовой-расчёт-2-по-теории-вероятностей"/>
+      <w:bookmarkStart w:id="35" w:name="_Toc231087997"/>
       <w:bookmarkEnd w:id="1"/>
       <w:bookmarkEnd w:id="33"/>
       <w:r>
@@ -13457,7 +13463,7 @@
         <w:lastRenderedPageBreak/>
         <w:t>Типовой расчёт №2 по теории вероятностей</w:t>
       </w:r>
-      <w:bookmarkEnd w:id="34"/>
+      <w:bookmarkEnd w:id="35"/>
     </w:p>
     <w:p>
       <w:pPr>
@@ -16527,7 +16533,6 @@
         <w:rPr>
           <w:rFonts w:ascii="Times New Roman" w:hAnsi="Times New Roman" w:cs="Times New Roman"/>
         </w:rPr>
-        <w:lastRenderedPageBreak/>
         <w:t>2.3. Условные законы распределения</w:t>
       </w:r>
     </w:p>
@@ -22753,7 +22758,6 @@
         <w:rPr>
           <w:rFonts w:ascii="Times New Roman" w:hAnsi="Times New Roman" w:cs="Times New Roman"/>
         </w:rPr>
-        <w:lastRenderedPageBreak/>
         <w:t>2.9. Обобщённая дисперсия</w:t>
       </w:r>
     </w:p>
@@ -27245,7 +27249,6 @@
         <w:rPr>
           <w:rFonts w:ascii="Times New Roman" w:hAnsi="Times New Roman" w:cs="Times New Roman"/>
         </w:rPr>
-        <w:lastRenderedPageBreak/>
         <w:t>3.4. Условные плотности</w:t>
       </w:r>
     </w:p>
@@ -31298,8 +31301,7 @@
     </w:p>
     <w:p>
       <w:pPr>
-        <w:pStyle w:val="Heading2"/>
-        <w:ind w:firstLine="340"/>
+        <w:pStyle w:val="Heading1"/>
         <w:rPr>
           <w:rFonts w:ascii="Times New Roman" w:hAnsi="Times New Roman" w:cs="Times New Roman"/>
           <w:lang w:val="ru-RU"/>
@@ -31307,7 +31309,7 @@
       </w:pPr>
       <w:bookmarkStart w:id="59" w:name="_Toc231088001"/>
       <w:bookmarkStart w:id="60" w:name="X2b075003e0f7c9bd50f0288ccb1db80f99bb0f5"/>
-      <w:bookmarkEnd w:id="35"/>
+      <w:bookmarkEnd w:id="34"/>
       <w:bookmarkEnd w:id="51"/>
       <w:bookmarkEnd w:id="58"/>
       <w:r>
@@ -31315,7 +31317,6 @@
           <w:rFonts w:ascii="Times New Roman" w:hAnsi="Times New Roman" w:cs="Times New Roman"/>
           <w:lang w:val="ru-RU"/>
         </w:rPr>
-        <w:lastRenderedPageBreak/>
         <w:t>Типовой расчёт №3 по математической статистике</w:t>
       </w:r>
       <w:bookmarkEnd w:id="59"/>
@@ -33319,10 +33320,8 @@
     </w:p>
     <w:p>
       <w:pPr>
-        <w:pStyle w:val="Heading3"/>
-        <w:ind w:firstLine="340"/>
-        <w:rPr>
-          <w:rFonts w:ascii="Times New Roman" w:hAnsi="Times New Roman" w:cs="Times New Roman"/>
+        <w:pStyle w:val="Heading2"/>
+        <w:rPr>
           <w:lang w:val="ru-RU"/>
         </w:rPr>
       </w:pPr>
@@ -33331,20 +33330,15 @@
       <w:bookmarkEnd w:id="62"/>
       <w:r>
         <w:rPr>
-          <w:rFonts w:ascii="Times New Roman" w:hAnsi="Times New Roman" w:cs="Times New Roman"/>
           <w:lang w:val="ru-RU"/>
         </w:rPr>
         <w:t xml:space="preserve">Часть </w:t>
       </w:r>
       <w:r>
-        <w:rPr>
-          <w:rFonts w:ascii="Times New Roman" w:hAnsi="Times New Roman" w:cs="Times New Roman"/>
-        </w:rPr>
         <w:t>I</w:t>
       </w:r>
       <w:r>
         <w:rPr>
-          <w:rFonts w:ascii="Times New Roman" w:hAnsi="Times New Roman" w:cs="Times New Roman"/>
           <w:lang w:val="ru-RU"/>
         </w:rPr>
         <w:t>. Первичная обработка статистических данных</w:t>
@@ -43069,7 +43063,6 @@
           <w:rFonts w:ascii="Times New Roman" w:hAnsi="Times New Roman" w:cs="Times New Roman"/>
           <w:lang w:val="ru-RU"/>
         </w:rPr>
-        <w:lastRenderedPageBreak/>
         <w:t>6. Доверительные интервалы для асимметрии и эксцесса</w:t>
       </w:r>
     </w:p>
@@ -45724,7 +45717,7 @@
       </w:tblPr>
       <w:tblGrid>
         <w:gridCol w:w="1439"/>
-        <w:gridCol w:w="430"/>
+        <w:gridCol w:w="445"/>
         <w:gridCol w:w="756"/>
       </w:tblGrid>
       <w:tr>
@@ -47188,7 +47181,6 @@
             <w:rPr>
               <w:rFonts w:ascii="Cambria Math" w:hAnsi="Cambria Math" w:cs="Times New Roman"/>
             </w:rPr>
-            <w:lastRenderedPageBreak/>
             <m:t>≈</m:t>
           </m:r>
           <m:r>

</xml_diff>